<commit_message>
docs: add project guidance document and architectural diagram for embeddings module
</commit_message>
<xml_diff>
--- a/Guias/guion_nacho.docx
+++ b/Guias/guion_nacho.docx
@@ -11,10 +11,10 @@
         </w:rPr>
       </w:pPr>
       <w:r>
-        <w:t>5</w:t>
-      </w:r>
-      <w:r>
-        <w:t>. Arquitectura Base y Seguridad: Multi-</w:t>
+        <w:t xml:space="preserve">H1 </w:t>
+      </w:r>
+      <w:r>
+        <w:t>Arquitectura Base y Seguridad: Multi-</w:t>
       </w:r>
       <w:proofErr w:type="spellStart"/>
       <w:r>
@@ -119,6 +119,9 @@
     </w:p>
     <w:p>
       <w:r>
+        <w:rPr>
+          <w:noProof/>
+        </w:rPr>
         <w:drawing>
           <wp:inline distT="0" distB="0" distL="0" distR="0" wp14:anchorId="637DB0D0" wp14:editId="70884A51">
             <wp:extent cx="5400040" cy="3597275"/>
@@ -1432,6 +1435,9 @@
         <w:jc w:val="center"/>
       </w:pPr>
       <w:r>
+        <w:rPr>
+          <w:noProof/>
+        </w:rPr>
         <w:drawing>
           <wp:inline distT="0" distB="0" distL="0" distR="0" wp14:anchorId="67F50AE7" wp14:editId="7AB7997D">
             <wp:extent cx="5400040" cy="3597275"/>
@@ -2495,6 +2501,403 @@
         <w:t xml:space="preserve"> Demuestra que sabéis configurar infraestructura en la nube real para adaptarla a las limitaciones físicas del hardware local, logrando que dos mundos distintos se entiendan a la perfección. </w:t>
       </w:r>
     </w:p>
+    <w:p>
+      <w:r>
+        <w:br w:type="page"/>
+      </w:r>
+    </w:p>
+    <w:p>
+      <w:pPr>
+        <w:pStyle w:val="Ttulo1"/>
+      </w:pPr>
+      <w:proofErr w:type="spellStart"/>
+      <w:r>
+        <w:lastRenderedPageBreak/>
+        <w:t>Speech</w:t>
+      </w:r>
+      <w:proofErr w:type="spellEnd"/>
+    </w:p>
+    <w:p>
+      <w:r>
+        <w:t>Para que nuestra plataforma sea un producto B2B verdaderamente viable, tuvimos que construir un entorno donde cada empresa opera</w:t>
+      </w:r>
+    </w:p>
+    <w:p>
+      <w:pPr>
+        <w:pStyle w:val="Prrafodelista"/>
+        <w:numPr>
+          <w:ilvl w:val="0"/>
+          <w:numId w:val="16"/>
+        </w:numPr>
+      </w:pPr>
+      <w:r>
+        <w:t>en un espacio totalmente hermético</w:t>
+      </w:r>
+    </w:p>
+    <w:p>
+      <w:pPr>
+        <w:pStyle w:val="Prrafodelista"/>
+        <w:numPr>
+          <w:ilvl w:val="0"/>
+          <w:numId w:val="16"/>
+        </w:numPr>
+      </w:pPr>
+      <w:r>
+        <w:t>garantizando así la privacidad de sus datos</w:t>
+      </w:r>
+    </w:p>
+    <w:p>
+      <w:pPr>
+        <w:pStyle w:val="Prrafodelista"/>
+        <w:numPr>
+          <w:ilvl w:val="0"/>
+          <w:numId w:val="16"/>
+        </w:numPr>
+      </w:pPr>
+      <w:r>
+        <w:t>un funcionamiento constante sin costes desorbitados de servidores.</w:t>
+      </w:r>
+    </w:p>
+    <w:p>
+      <w:r>
+        <w:t>A continuación, veremos las dos claves de este logro:</w:t>
+      </w:r>
+    </w:p>
+    <w:p>
+      <w:pPr>
+        <w:pStyle w:val="Prrafodelista"/>
+        <w:numPr>
+          <w:ilvl w:val="0"/>
+          <w:numId w:val="17"/>
+        </w:numPr>
+      </w:pPr>
+      <w:r>
+        <w:t>cómo protegemos la información corporativa</w:t>
+      </w:r>
+    </w:p>
+    <w:p>
+      <w:pPr>
+        <w:pStyle w:val="Prrafodelista"/>
+        <w:numPr>
+          <w:ilvl w:val="0"/>
+          <w:numId w:val="17"/>
+        </w:numPr>
+      </w:pPr>
+      <w:r>
+        <w:t>cómo estructuramos nuestra red de forma inteligente.</w:t>
+      </w:r>
+    </w:p>
+    <w:p>
+      <w:pPr>
+        <w:rPr>
+          <w:b/>
+          <w:bCs/>
+          <w:u w:val="single"/>
+        </w:rPr>
+      </w:pPr>
+      <w:r>
+        <w:rPr>
+          <w:b/>
+          <w:bCs/>
+          <w:u w:val="single"/>
+        </w:rPr>
+        <w:t>H2 Seguridad y Aislamiento de la Información Corporativa</w:t>
+      </w:r>
+    </w:p>
+    <w:p>
+      <w:r>
+        <w:t xml:space="preserve">El primer pilar es la seguridad. Un cliente jamás debe tener acceso a los documentos o datos de otro; a esto lo llamamos un entorno aislado. En línea con lo anterior, también manejamos quién entra y quién sale, así como qué puede hacer cada empleado, </w:t>
+      </w:r>
+      <w:r>
+        <w:rPr>
+          <w:b/>
+          <w:bCs/>
+        </w:rPr>
+        <w:t>gestión que realizamos a través de Clerk</w:t>
+      </w:r>
+      <w:r>
+        <w:t>. Si un empleado no tiene permisos para editar documentos, el sistema no se lo permite.</w:t>
+      </w:r>
+    </w:p>
+    <w:p>
+      <w:r>
+        <w:t xml:space="preserve">Como se ve en la imagen, tenemos ambos clientes con sus respectivos empleados, pero ninguno puede acceder a la información del otro. Esto se debe a que toda la administración de la base de datos </w:t>
+      </w:r>
+      <w:r>
+        <w:rPr>
+          <w:b/>
+          <w:bCs/>
+        </w:rPr>
+        <w:t xml:space="preserve">en </w:t>
+      </w:r>
+      <w:proofErr w:type="spellStart"/>
+      <w:r>
+        <w:rPr>
+          <w:b/>
+          <w:bCs/>
+        </w:rPr>
+        <w:t>Supabase</w:t>
+      </w:r>
+      <w:proofErr w:type="spellEnd"/>
+      <w:r>
+        <w:rPr>
+          <w:b/>
+          <w:bCs/>
+        </w:rPr>
+        <w:t xml:space="preserve"> cuenta con políticas de </w:t>
+      </w:r>
+      <w:proofErr w:type="spellStart"/>
+      <w:r>
+        <w:rPr>
+          <w:b/>
+          <w:bCs/>
+        </w:rPr>
+        <w:t>Row</w:t>
+      </w:r>
+      <w:proofErr w:type="spellEnd"/>
+      <w:r>
+        <w:rPr>
+          <w:b/>
+          <w:bCs/>
+        </w:rPr>
+        <w:t xml:space="preserve"> </w:t>
+      </w:r>
+      <w:proofErr w:type="spellStart"/>
+      <w:r>
+        <w:rPr>
+          <w:b/>
+          <w:bCs/>
+        </w:rPr>
+        <w:t>Level</w:t>
+      </w:r>
+      <w:proofErr w:type="spellEnd"/>
+      <w:r>
+        <w:rPr>
+          <w:b/>
+          <w:bCs/>
+        </w:rPr>
+        <w:t xml:space="preserve"> Security (RLS)</w:t>
+      </w:r>
+      <w:r>
+        <w:t>, las cuales se encargan de filtrar, mostrar u ocultar la información dependiendo estrictamente del rol y del entorno del usuario.</w:t>
+      </w:r>
+    </w:p>
+    <w:p>
+      <w:pPr>
+        <w:rPr>
+          <w:b/>
+          <w:bCs/>
+          <w:u w:val="single"/>
+        </w:rPr>
+      </w:pPr>
+      <w:r>
+        <w:rPr>
+          <w:b/>
+          <w:bCs/>
+          <w:u w:val="single"/>
+        </w:rPr>
+        <w:t>Despliegue Híbrido: Privacidad Absoluta y Ahorro de Costes</w:t>
+      </w:r>
+    </w:p>
+    <w:p>
+      <w:r>
+        <w:t xml:space="preserve">El segundo gran pilar es la conectividad. </w:t>
+      </w:r>
+      <w:r>
+        <w:rPr>
+          <w:b/>
+          <w:bCs/>
+        </w:rPr>
+        <w:t>Alquilar potencia de cómputo o servidores</w:t>
+      </w:r>
+      <w:r>
+        <w:t xml:space="preserve"> en la nube para alojar y </w:t>
+      </w:r>
+      <w:r>
+        <w:rPr>
+          <w:b/>
+          <w:bCs/>
+        </w:rPr>
+        <w:t>ejecutar la aplicación web y el modelo de IA</w:t>
+      </w:r>
+      <w:r>
+        <w:t xml:space="preserve"> hubiese disparado los costes. Por eso, implementamos una arquitectura híbrida: </w:t>
+      </w:r>
+    </w:p>
+    <w:p>
+      <w:pPr>
+        <w:pStyle w:val="Prrafodelista"/>
+        <w:numPr>
+          <w:ilvl w:val="0"/>
+          <w:numId w:val="18"/>
+        </w:numPr>
+      </w:pPr>
+      <w:r>
+        <w:t xml:space="preserve">la interfaz gráfica y la aplicación web que usan los clientes están alojadas en la nube, </w:t>
+      </w:r>
+      <w:r>
+        <w:rPr>
+          <w:b/>
+          <w:bCs/>
+        </w:rPr>
+        <w:t>mientras que</w:t>
+      </w:r>
+      <w:r>
+        <w:t xml:space="preserve"> </w:t>
+      </w:r>
+    </w:p>
+    <w:p>
+      <w:pPr>
+        <w:pStyle w:val="Prrafodelista"/>
+        <w:numPr>
+          <w:ilvl w:val="0"/>
+          <w:numId w:val="18"/>
+        </w:numPr>
+      </w:pPr>
+      <w:r>
+        <w:t>el núcleo de razonamiento de la Inteligencia Artificial se ejecuta directamente en los servidores locales físicos de la empresa.</w:t>
+      </w:r>
+    </w:p>
+    <w:p>
+      <w:r>
+        <w:rPr>
+          <w:b/>
+          <w:bCs/>
+        </w:rPr>
+        <w:t>Como se muestra en el diagrama, a la izquierda</w:t>
+      </w:r>
+      <w:r>
+        <w:t xml:space="preserve"> tenemos nuestro hosting con las herramientas de la interfaz. </w:t>
+      </w:r>
+      <w:r>
+        <w:rPr>
+          <w:b/>
+          <w:bCs/>
+        </w:rPr>
+        <w:t>Por otro lado, en el nodo local, contamos con</w:t>
+      </w:r>
+      <w:r>
+        <w:t xml:space="preserve"> las herramientas que usamos para hacer funcionar </w:t>
+      </w:r>
+      <w:r>
+        <w:rPr>
+          <w:b/>
+          <w:bCs/>
+        </w:rPr>
+        <w:t>y dar contexto a nuestro modelo</w:t>
+      </w:r>
+      <w:r>
+        <w:t>, donde:</w:t>
+      </w:r>
+    </w:p>
+    <w:p>
+      <w:pPr>
+        <w:numPr>
+          <w:ilvl w:val="0"/>
+          <w:numId w:val="14"/>
+        </w:numPr>
+      </w:pPr>
+      <w:proofErr w:type="spellStart"/>
+      <w:r>
+        <w:rPr>
+          <w:b/>
+          <w:bCs/>
+        </w:rPr>
+        <w:t>FastAPI</w:t>
+      </w:r>
+      <w:proofErr w:type="spellEnd"/>
+      <w:r>
+        <w:t xml:space="preserve"> se encarga de hacer de puente entre las consultas del usuario y la IA.</w:t>
+      </w:r>
+    </w:p>
+    <w:p>
+      <w:pPr>
+        <w:numPr>
+          <w:ilvl w:val="0"/>
+          <w:numId w:val="14"/>
+        </w:numPr>
+      </w:pPr>
+      <w:proofErr w:type="spellStart"/>
+      <w:r>
+        <w:rPr>
+          <w:b/>
+          <w:bCs/>
+        </w:rPr>
+        <w:t>Uvicorn</w:t>
+      </w:r>
+      <w:proofErr w:type="spellEnd"/>
+      <w:r>
+        <w:t xml:space="preserve"> hace que </w:t>
+      </w:r>
+      <w:proofErr w:type="spellStart"/>
+      <w:r>
+        <w:t>FastAPI</w:t>
+      </w:r>
+      <w:proofErr w:type="spellEnd"/>
+      <w:r>
+        <w:t xml:space="preserve"> se mantenga activo y escuchando en tiempo real.</w:t>
+      </w:r>
+    </w:p>
+    <w:p>
+      <w:pPr>
+        <w:numPr>
+          <w:ilvl w:val="0"/>
+          <w:numId w:val="14"/>
+        </w:numPr>
+      </w:pPr>
+      <w:proofErr w:type="spellStart"/>
+      <w:r>
+        <w:rPr>
+          <w:b/>
+          <w:bCs/>
+        </w:rPr>
+        <w:t>ChromaDB</w:t>
+      </w:r>
+      <w:proofErr w:type="spellEnd"/>
+      <w:r>
+        <w:rPr>
+          <w:b/>
+          <w:bCs/>
+        </w:rPr>
+        <w:t xml:space="preserve"> actúa como nuestra</w:t>
+      </w:r>
+      <w:r>
+        <w:t xml:space="preserve"> base de datos vectorial para el contexto de la IA.</w:t>
+      </w:r>
+    </w:p>
+    <w:p>
+      <w:r>
+        <w:t xml:space="preserve">Y en el medio, el túnel de </w:t>
+      </w:r>
+      <w:proofErr w:type="spellStart"/>
+      <w:r>
+        <w:rPr>
+          <w:b/>
+          <w:bCs/>
+        </w:rPr>
+        <w:t>Ngrok</w:t>
+      </w:r>
+      <w:proofErr w:type="spellEnd"/>
+      <w:r>
+        <w:t xml:space="preserve"> permite que la página web (alojada en la nube de </w:t>
+      </w:r>
+      <w:proofErr w:type="spellStart"/>
+      <w:r>
+        <w:t>Vercel</w:t>
+      </w:r>
+      <w:proofErr w:type="spellEnd"/>
+      <w:r>
+        <w:t xml:space="preserve">) pueda conectarse directamente con nuestra IA local de forma privada, sin necesidad de configurar redes complejas ni pagar por </w:t>
+      </w:r>
+      <w:proofErr w:type="spellStart"/>
+      <w:r>
+        <w:t>IPs</w:t>
+      </w:r>
+      <w:proofErr w:type="spellEnd"/>
+      <w:r>
+        <w:t xml:space="preserve"> públicas."</w:t>
+      </w:r>
+    </w:p>
     <w:p/>
     <w:sectPr>
       <w:pgSz w:w="11906" w:h="16838"/>
@@ -2509,6 +2912,183 @@
 <file path=word/numbering.xml><?xml version="1.0" encoding="utf-8"?>
 <w:numbering xmlns:wpc="http://schemas.microsoft.com/office/word/2010/wordprocessingCanvas" xmlns:cx="http://schemas.microsoft.com/office/drawing/2014/chartex" xmlns:cx1="http://schemas.microsoft.com/office/drawing/2015/9/8/chartex" xmlns:cx2="http://schemas.microsoft.com/office/drawing/2015/10/21/chartex" xmlns:cx3="http://schemas.microsoft.com/office/drawing/2016/5/9/chartex" xmlns:cx4="http://schemas.microsoft.com/office/drawing/2016/5/10/chartex" xmlns:cx5="http://schemas.microsoft.com/office/drawing/2016/5/11/chartex" xmlns:cx6="http://schemas.microsoft.com/office/drawing/2016/5/12/chartex" xmlns:cx7="http://schemas.microsoft.com/office/drawing/2016/5/13/chartex" xmlns:cx8="http://schemas.microsoft.com/office/drawing/2016/5/14/chartex" xmlns:mc="http://schemas.openxmlformats.org/markup-compatibility/2006" xmlns:aink="http://schemas.microsoft.com/office/drawing/2016/ink" xmlns:am3d="http://schemas.microsoft.com/office/drawing/2017/model3d" xmlns:o="urn:schemas-microsoft-com:office:office" xmlns:oel="http://schemas.microsoft.com/office/2019/extlst" xmlns:r="http://schemas.openxmlformats.org/officeDocument/2006/relationships" xmlns:m="http://schemas.openxmlformats.org/officeDocument/2006/math" xmlns:v="urn:schemas-microsoft-com:vml" xmlns:wp14="http://schemas.microsoft.com/office/word/2010/wordprocessingDrawing" xmlns:wp="http://schemas.openxmlformats.org/drawingml/2006/wordprocessingDrawing" xmlns:w10="urn:schemas-microsoft-com:office:word" xmlns:w="http://schemas.openxmlformats.org/wordprocessingml/2006/main" xmlns:w14="http://schemas.microsoft.com/office/word/2010/wordml" xmlns:w15="http://schemas.microsoft.com/office/word/2012/wordml" xmlns:w16cex="http://schemas.microsoft.com/office/word/2018/wordml/cex" xmlns:w16cid="http://schemas.microsoft.com/office/word/2016/wordml/cid" xmlns:w16="http://schemas.microsoft.com/office/word/2018/wordml" xmlns:w16sdtdh="http://schemas.microsoft.com/office/word/2020/wordml/sdtdatahash" xmlns:w16se="http://schemas.microsoft.com/office/word/2015/wordml/symex" xmlns:wpg="http://schemas.microsoft.com/office/word/2010/wordprocessingGroup" xmlns:wpi="http://schemas.microsoft.com/office/word/2010/wordprocessingInk" xmlns:wne="http://schemas.microsoft.com/office/word/2006/wordml" xmlns:wps="http://schemas.microsoft.com/office/word/2010/wordprocessingShape" mc:Ignorable="w14 w15 w16se w16cid w16 w16cex w16sdtdh wp14">
   <w:abstractNum w:abstractNumId="0" w15:restartNumberingAfterBreak="0">
+    <w:nsid w:val="00000001"/>
+    <w:multiLevelType w:val="hybridMultilevel"/>
+    <w:tmpl w:val="FFFFFFFF"/>
+    <w:lvl w:ilvl="0" w:tplc="FFFFFFFF">
+      <w:start w:val="1"/>
+      <w:numFmt w:val="decimal"/>
+      <w:lvlText w:val="%1."/>
+      <w:lvlJc w:val="left"/>
+      <w:pPr>
+        <w:tabs>
+          <w:tab w:val="num" w:pos="0"/>
+        </w:tabs>
+      </w:pPr>
+    </w:lvl>
+    <w:lvl w:ilvl="1" w:tplc="FFFFFFFF">
+      <w:numFmt w:val="bullet"/>
+      <w:lvlText w:val="·"/>
+      <w:lvlJc w:val="left"/>
+      <w:pPr>
+        <w:tabs>
+          <w:tab w:val="num" w:pos="0"/>
+        </w:tabs>
+      </w:pPr>
+      <w:rPr>
+        <w:rFonts w:ascii="Symbol" w:hAnsi="Symbol" w:cs="Symbol"/>
+      </w:rPr>
+    </w:lvl>
+    <w:lvl w:ilvl="2" w:tplc="FFFFFFFF">
+      <w:numFmt w:val="decimal"/>
+      <w:lvlText w:val=""/>
+      <w:lvlJc w:val="left"/>
+    </w:lvl>
+    <w:lvl w:ilvl="3" w:tplc="FFFFFFFF">
+      <w:numFmt w:val="decimal"/>
+      <w:lvlText w:val=""/>
+      <w:lvlJc w:val="left"/>
+    </w:lvl>
+    <w:lvl w:ilvl="4" w:tplc="FFFFFFFF">
+      <w:numFmt w:val="decimal"/>
+      <w:lvlText w:val=""/>
+      <w:lvlJc w:val="left"/>
+    </w:lvl>
+    <w:lvl w:ilvl="5" w:tplc="FFFFFFFF">
+      <w:numFmt w:val="decimal"/>
+      <w:lvlText w:val=""/>
+      <w:lvlJc w:val="left"/>
+    </w:lvl>
+    <w:lvl w:ilvl="6" w:tplc="FFFFFFFF">
+      <w:numFmt w:val="decimal"/>
+      <w:lvlText w:val=""/>
+      <w:lvlJc w:val="left"/>
+    </w:lvl>
+    <w:lvl w:ilvl="7" w:tplc="FFFFFFFF">
+      <w:numFmt w:val="decimal"/>
+      <w:lvlText w:val=""/>
+      <w:lvlJc w:val="left"/>
+    </w:lvl>
+    <w:lvl w:ilvl="8" w:tplc="FFFFFFFF">
+      <w:numFmt w:val="decimal"/>
+      <w:lvlText w:val=""/>
+      <w:lvlJc w:val="left"/>
+    </w:lvl>
+  </w:abstractNum>
+  <w:abstractNum w:abstractNumId="1" w15:restartNumberingAfterBreak="0">
+    <w:nsid w:val="06E23405"/>
+    <w:multiLevelType w:val="hybridMultilevel"/>
+    <w:tmpl w:val="B218F5F6"/>
+    <w:lvl w:ilvl="0" w:tplc="0C0A0001">
+      <w:start w:val="1"/>
+      <w:numFmt w:val="bullet"/>
+      <w:lvlText w:val=""/>
+      <w:lvlJc w:val="left"/>
+      <w:pPr>
+        <w:ind w:left="720" w:hanging="360"/>
+      </w:pPr>
+      <w:rPr>
+        <w:rFonts w:ascii="Symbol" w:hAnsi="Symbol" w:hint="default"/>
+      </w:rPr>
+    </w:lvl>
+    <w:lvl w:ilvl="1" w:tplc="0C0A0003" w:tentative="1">
+      <w:start w:val="1"/>
+      <w:numFmt w:val="bullet"/>
+      <w:lvlText w:val="o"/>
+      <w:lvlJc w:val="left"/>
+      <w:pPr>
+        <w:ind w:left="1440" w:hanging="360"/>
+      </w:pPr>
+      <w:rPr>
+        <w:rFonts w:ascii="Courier New" w:hAnsi="Courier New" w:cs="Courier New" w:hint="default"/>
+      </w:rPr>
+    </w:lvl>
+    <w:lvl w:ilvl="2" w:tplc="0C0A0005" w:tentative="1">
+      <w:start w:val="1"/>
+      <w:numFmt w:val="bullet"/>
+      <w:lvlText w:val=""/>
+      <w:lvlJc w:val="left"/>
+      <w:pPr>
+        <w:ind w:left="2160" w:hanging="360"/>
+      </w:pPr>
+      <w:rPr>
+        <w:rFonts w:ascii="Wingdings" w:hAnsi="Wingdings" w:hint="default"/>
+      </w:rPr>
+    </w:lvl>
+    <w:lvl w:ilvl="3" w:tplc="0C0A0001" w:tentative="1">
+      <w:start w:val="1"/>
+      <w:numFmt w:val="bullet"/>
+      <w:lvlText w:val=""/>
+      <w:lvlJc w:val="left"/>
+      <w:pPr>
+        <w:ind w:left="2880" w:hanging="360"/>
+      </w:pPr>
+      <w:rPr>
+        <w:rFonts w:ascii="Symbol" w:hAnsi="Symbol" w:hint="default"/>
+      </w:rPr>
+    </w:lvl>
+    <w:lvl w:ilvl="4" w:tplc="0C0A0003" w:tentative="1">
+      <w:start w:val="1"/>
+      <w:numFmt w:val="bullet"/>
+      <w:lvlText w:val="o"/>
+      <w:lvlJc w:val="left"/>
+      <w:pPr>
+        <w:ind w:left="3600" w:hanging="360"/>
+      </w:pPr>
+      <w:rPr>
+        <w:rFonts w:ascii="Courier New" w:hAnsi="Courier New" w:cs="Courier New" w:hint="default"/>
+      </w:rPr>
+    </w:lvl>
+    <w:lvl w:ilvl="5" w:tplc="0C0A0005" w:tentative="1">
+      <w:start w:val="1"/>
+      <w:numFmt w:val="bullet"/>
+      <w:lvlText w:val=""/>
+      <w:lvlJc w:val="left"/>
+      <w:pPr>
+        <w:ind w:left="4320" w:hanging="360"/>
+      </w:pPr>
+      <w:rPr>
+        <w:rFonts w:ascii="Wingdings" w:hAnsi="Wingdings" w:hint="default"/>
+      </w:rPr>
+    </w:lvl>
+    <w:lvl w:ilvl="6" w:tplc="0C0A0001" w:tentative="1">
+      <w:start w:val="1"/>
+      <w:numFmt w:val="bullet"/>
+      <w:lvlText w:val=""/>
+      <w:lvlJc w:val="left"/>
+      <w:pPr>
+        <w:ind w:left="5040" w:hanging="360"/>
+      </w:pPr>
+      <w:rPr>
+        <w:rFonts w:ascii="Symbol" w:hAnsi="Symbol" w:hint="default"/>
+      </w:rPr>
+    </w:lvl>
+    <w:lvl w:ilvl="7" w:tplc="0C0A0003" w:tentative="1">
+      <w:start w:val="1"/>
+      <w:numFmt w:val="bullet"/>
+      <w:lvlText w:val="o"/>
+      <w:lvlJc w:val="left"/>
+      <w:pPr>
+        <w:ind w:left="5760" w:hanging="360"/>
+      </w:pPr>
+      <w:rPr>
+        <w:rFonts w:ascii="Courier New" w:hAnsi="Courier New" w:cs="Courier New" w:hint="default"/>
+      </w:rPr>
+    </w:lvl>
+    <w:lvl w:ilvl="8" w:tplc="0C0A0005" w:tentative="1">
+      <w:start w:val="1"/>
+      <w:numFmt w:val="bullet"/>
+      <w:lvlText w:val=""/>
+      <w:lvlJc w:val="left"/>
+      <w:pPr>
+        <w:ind w:left="6480" w:hanging="360"/>
+      </w:pPr>
+      <w:rPr>
+        <w:rFonts w:ascii="Wingdings" w:hAnsi="Wingdings" w:hint="default"/>
+      </w:rPr>
+    </w:lvl>
+  </w:abstractNum>
+  <w:abstractNum w:abstractNumId="2" w15:restartNumberingAfterBreak="0">
     <w:nsid w:val="0AC547DA"/>
     <w:multiLevelType w:val="multilevel"/>
     <w:tmpl w:val="67580918"/>
@@ -2621,7 +3201,120 @@
       </w:pPr>
     </w:lvl>
   </w:abstractNum>
-  <w:abstractNum w:abstractNumId="1" w15:restartNumberingAfterBreak="0">
+  <w:abstractNum w:abstractNumId="3" w15:restartNumberingAfterBreak="0">
+    <w:nsid w:val="13E86396"/>
+    <w:multiLevelType w:val="hybridMultilevel"/>
+    <w:tmpl w:val="6E2A9B6A"/>
+    <w:lvl w:ilvl="0" w:tplc="0C0A0001">
+      <w:start w:val="1"/>
+      <w:numFmt w:val="bullet"/>
+      <w:lvlText w:val=""/>
+      <w:lvlJc w:val="left"/>
+      <w:pPr>
+        <w:ind w:left="720" w:hanging="360"/>
+      </w:pPr>
+      <w:rPr>
+        <w:rFonts w:ascii="Symbol" w:hAnsi="Symbol" w:hint="default"/>
+      </w:rPr>
+    </w:lvl>
+    <w:lvl w:ilvl="1" w:tplc="0C0A0003" w:tentative="1">
+      <w:start w:val="1"/>
+      <w:numFmt w:val="bullet"/>
+      <w:lvlText w:val="o"/>
+      <w:lvlJc w:val="left"/>
+      <w:pPr>
+        <w:ind w:left="1440" w:hanging="360"/>
+      </w:pPr>
+      <w:rPr>
+        <w:rFonts w:ascii="Courier New" w:hAnsi="Courier New" w:cs="Courier New" w:hint="default"/>
+      </w:rPr>
+    </w:lvl>
+    <w:lvl w:ilvl="2" w:tplc="0C0A0005" w:tentative="1">
+      <w:start w:val="1"/>
+      <w:numFmt w:val="bullet"/>
+      <w:lvlText w:val=""/>
+      <w:lvlJc w:val="left"/>
+      <w:pPr>
+        <w:ind w:left="2160" w:hanging="360"/>
+      </w:pPr>
+      <w:rPr>
+        <w:rFonts w:ascii="Wingdings" w:hAnsi="Wingdings" w:hint="default"/>
+      </w:rPr>
+    </w:lvl>
+    <w:lvl w:ilvl="3" w:tplc="0C0A0001" w:tentative="1">
+      <w:start w:val="1"/>
+      <w:numFmt w:val="bullet"/>
+      <w:lvlText w:val=""/>
+      <w:lvlJc w:val="left"/>
+      <w:pPr>
+        <w:ind w:left="2880" w:hanging="360"/>
+      </w:pPr>
+      <w:rPr>
+        <w:rFonts w:ascii="Symbol" w:hAnsi="Symbol" w:hint="default"/>
+      </w:rPr>
+    </w:lvl>
+    <w:lvl w:ilvl="4" w:tplc="0C0A0003" w:tentative="1">
+      <w:start w:val="1"/>
+      <w:numFmt w:val="bullet"/>
+      <w:lvlText w:val="o"/>
+      <w:lvlJc w:val="left"/>
+      <w:pPr>
+        <w:ind w:left="3600" w:hanging="360"/>
+      </w:pPr>
+      <w:rPr>
+        <w:rFonts w:ascii="Courier New" w:hAnsi="Courier New" w:cs="Courier New" w:hint="default"/>
+      </w:rPr>
+    </w:lvl>
+    <w:lvl w:ilvl="5" w:tplc="0C0A0005" w:tentative="1">
+      <w:start w:val="1"/>
+      <w:numFmt w:val="bullet"/>
+      <w:lvlText w:val=""/>
+      <w:lvlJc w:val="left"/>
+      <w:pPr>
+        <w:ind w:left="4320" w:hanging="360"/>
+      </w:pPr>
+      <w:rPr>
+        <w:rFonts w:ascii="Wingdings" w:hAnsi="Wingdings" w:hint="default"/>
+      </w:rPr>
+    </w:lvl>
+    <w:lvl w:ilvl="6" w:tplc="0C0A0001" w:tentative="1">
+      <w:start w:val="1"/>
+      <w:numFmt w:val="bullet"/>
+      <w:lvlText w:val=""/>
+      <w:lvlJc w:val="left"/>
+      <w:pPr>
+        <w:ind w:left="5040" w:hanging="360"/>
+      </w:pPr>
+      <w:rPr>
+        <w:rFonts w:ascii="Symbol" w:hAnsi="Symbol" w:hint="default"/>
+      </w:rPr>
+    </w:lvl>
+    <w:lvl w:ilvl="7" w:tplc="0C0A0003" w:tentative="1">
+      <w:start w:val="1"/>
+      <w:numFmt w:val="bullet"/>
+      <w:lvlText w:val="o"/>
+      <w:lvlJc w:val="left"/>
+      <w:pPr>
+        <w:ind w:left="5760" w:hanging="360"/>
+      </w:pPr>
+      <w:rPr>
+        <w:rFonts w:ascii="Courier New" w:hAnsi="Courier New" w:cs="Courier New" w:hint="default"/>
+      </w:rPr>
+    </w:lvl>
+    <w:lvl w:ilvl="8" w:tplc="0C0A0005" w:tentative="1">
+      <w:start w:val="1"/>
+      <w:numFmt w:val="bullet"/>
+      <w:lvlText w:val=""/>
+      <w:lvlJc w:val="left"/>
+      <w:pPr>
+        <w:ind w:left="6480" w:hanging="360"/>
+      </w:pPr>
+      <w:rPr>
+        <w:rFonts w:ascii="Wingdings" w:hAnsi="Wingdings" w:hint="default"/>
+      </w:rPr>
+    </w:lvl>
+  </w:abstractNum>
+  <w:abstractNum w:abstractNumId="4" w15:restartNumberingAfterBreak="0">
     <w:nsid w:val="220C4CFA"/>
     <w:multiLevelType w:val="multilevel"/>
     <w:tmpl w:val="A2007872"/>
@@ -2770,7 +3463,156 @@
       </w:rPr>
     </w:lvl>
   </w:abstractNum>
-  <w:abstractNum w:abstractNumId="2" w15:restartNumberingAfterBreak="0">
+  <w:abstractNum w:abstractNumId="5" w15:restartNumberingAfterBreak="0">
+    <w:nsid w:val="34166C3C"/>
+    <w:multiLevelType w:val="multilevel"/>
+    <w:tmpl w:val="373A0A34"/>
+    <w:lvl w:ilvl="0">
+      <w:start w:val="1"/>
+      <w:numFmt w:val="bullet"/>
+      <w:lvlText w:val=""/>
+      <w:lvlJc w:val="left"/>
+      <w:pPr>
+        <w:tabs>
+          <w:tab w:val="num" w:pos="720"/>
+        </w:tabs>
+        <w:ind w:left="720" w:hanging="360"/>
+      </w:pPr>
+      <w:rPr>
+        <w:rFonts w:ascii="Symbol" w:hAnsi="Symbol" w:hint="default"/>
+        <w:sz w:val="20"/>
+      </w:rPr>
+    </w:lvl>
+    <w:lvl w:ilvl="1" w:tentative="1">
+      <w:start w:val="1"/>
+      <w:numFmt w:val="bullet"/>
+      <w:lvlText w:val="o"/>
+      <w:lvlJc w:val="left"/>
+      <w:pPr>
+        <w:tabs>
+          <w:tab w:val="num" w:pos="1440"/>
+        </w:tabs>
+        <w:ind w:left="1440" w:hanging="360"/>
+      </w:pPr>
+      <w:rPr>
+        <w:rFonts w:ascii="Courier New" w:hAnsi="Courier New" w:hint="default"/>
+        <w:sz w:val="20"/>
+      </w:rPr>
+    </w:lvl>
+    <w:lvl w:ilvl="2" w:tentative="1">
+      <w:start w:val="1"/>
+      <w:numFmt w:val="bullet"/>
+      <w:lvlText w:val=""/>
+      <w:lvlJc w:val="left"/>
+      <w:pPr>
+        <w:tabs>
+          <w:tab w:val="num" w:pos="2160"/>
+        </w:tabs>
+        <w:ind w:left="2160" w:hanging="360"/>
+      </w:pPr>
+      <w:rPr>
+        <w:rFonts w:ascii="Wingdings" w:hAnsi="Wingdings" w:hint="default"/>
+        <w:sz w:val="20"/>
+      </w:rPr>
+    </w:lvl>
+    <w:lvl w:ilvl="3" w:tentative="1">
+      <w:start w:val="1"/>
+      <w:numFmt w:val="bullet"/>
+      <w:lvlText w:val=""/>
+      <w:lvlJc w:val="left"/>
+      <w:pPr>
+        <w:tabs>
+          <w:tab w:val="num" w:pos="2880"/>
+        </w:tabs>
+        <w:ind w:left="2880" w:hanging="360"/>
+      </w:pPr>
+      <w:rPr>
+        <w:rFonts w:ascii="Wingdings" w:hAnsi="Wingdings" w:hint="default"/>
+        <w:sz w:val="20"/>
+      </w:rPr>
+    </w:lvl>
+    <w:lvl w:ilvl="4" w:tentative="1">
+      <w:start w:val="1"/>
+      <w:numFmt w:val="bullet"/>
+      <w:lvlText w:val=""/>
+      <w:lvlJc w:val="left"/>
+      <w:pPr>
+        <w:tabs>
+          <w:tab w:val="num" w:pos="3600"/>
+        </w:tabs>
+        <w:ind w:left="3600" w:hanging="360"/>
+      </w:pPr>
+      <w:rPr>
+        <w:rFonts w:ascii="Wingdings" w:hAnsi="Wingdings" w:hint="default"/>
+        <w:sz w:val="20"/>
+      </w:rPr>
+    </w:lvl>
+    <w:lvl w:ilvl="5" w:tentative="1">
+      <w:start w:val="1"/>
+      <w:numFmt w:val="bullet"/>
+      <w:lvlText w:val=""/>
+      <w:lvlJc w:val="left"/>
+      <w:pPr>
+        <w:tabs>
+          <w:tab w:val="num" w:pos="4320"/>
+        </w:tabs>
+        <w:ind w:left="4320" w:hanging="360"/>
+      </w:pPr>
+      <w:rPr>
+        <w:rFonts w:ascii="Wingdings" w:hAnsi="Wingdings" w:hint="default"/>
+        <w:sz w:val="20"/>
+      </w:rPr>
+    </w:lvl>
+    <w:lvl w:ilvl="6" w:tentative="1">
+      <w:start w:val="1"/>
+      <w:numFmt w:val="bullet"/>
+      <w:lvlText w:val=""/>
+      <w:lvlJc w:val="left"/>
+      <w:pPr>
+        <w:tabs>
+          <w:tab w:val="num" w:pos="5040"/>
+        </w:tabs>
+        <w:ind w:left="5040" w:hanging="360"/>
+      </w:pPr>
+      <w:rPr>
+        <w:rFonts w:ascii="Wingdings" w:hAnsi="Wingdings" w:hint="default"/>
+        <w:sz w:val="20"/>
+      </w:rPr>
+    </w:lvl>
+    <w:lvl w:ilvl="7" w:tentative="1">
+      <w:start w:val="1"/>
+      <w:numFmt w:val="bullet"/>
+      <w:lvlText w:val=""/>
+      <w:lvlJc w:val="left"/>
+      <w:pPr>
+        <w:tabs>
+          <w:tab w:val="num" w:pos="5760"/>
+        </w:tabs>
+        <w:ind w:left="5760" w:hanging="360"/>
+      </w:pPr>
+      <w:rPr>
+        <w:rFonts w:ascii="Wingdings" w:hAnsi="Wingdings" w:hint="default"/>
+        <w:sz w:val="20"/>
+      </w:rPr>
+    </w:lvl>
+    <w:lvl w:ilvl="8" w:tentative="1">
+      <w:start w:val="1"/>
+      <w:numFmt w:val="bullet"/>
+      <w:lvlText w:val=""/>
+      <w:lvlJc w:val="left"/>
+      <w:pPr>
+        <w:tabs>
+          <w:tab w:val="num" w:pos="6480"/>
+        </w:tabs>
+        <w:ind w:left="6480" w:hanging="360"/>
+      </w:pPr>
+      <w:rPr>
+        <w:rFonts w:ascii="Wingdings" w:hAnsi="Wingdings" w:hint="default"/>
+        <w:sz w:val="20"/>
+      </w:rPr>
+    </w:lvl>
+  </w:abstractNum>
+  <w:abstractNum w:abstractNumId="6" w15:restartNumberingAfterBreak="0">
     <w:nsid w:val="3E464B73"/>
     <w:multiLevelType w:val="multilevel"/>
     <w:tmpl w:val="670E232C"/>
@@ -2883,7 +3725,7 @@
       </w:pPr>
     </w:lvl>
   </w:abstractNum>
-  <w:abstractNum w:abstractNumId="3" w15:restartNumberingAfterBreak="0">
+  <w:abstractNum w:abstractNumId="7" w15:restartNumberingAfterBreak="0">
     <w:nsid w:val="41646D65"/>
     <w:multiLevelType w:val="multilevel"/>
     <w:tmpl w:val="1158D554"/>
@@ -3028,7 +3870,7 @@
       </w:rPr>
     </w:lvl>
   </w:abstractNum>
-  <w:abstractNum w:abstractNumId="4" w15:restartNumberingAfterBreak="0">
+  <w:abstractNum w:abstractNumId="8" w15:restartNumberingAfterBreak="0">
     <w:nsid w:val="4A4869AA"/>
     <w:multiLevelType w:val="multilevel"/>
     <w:tmpl w:val="D082C8FE"/>
@@ -3177,7 +4019,7 @@
       </w:rPr>
     </w:lvl>
   </w:abstractNum>
-  <w:abstractNum w:abstractNumId="5" w15:restartNumberingAfterBreak="0">
+  <w:abstractNum w:abstractNumId="9" w15:restartNumberingAfterBreak="0">
     <w:nsid w:val="502F73ED"/>
     <w:multiLevelType w:val="multilevel"/>
     <w:tmpl w:val="36C0D318"/>
@@ -3326,7 +4168,120 @@
       </w:rPr>
     </w:lvl>
   </w:abstractNum>
-  <w:abstractNum w:abstractNumId="6" w15:restartNumberingAfterBreak="0">
+  <w:abstractNum w:abstractNumId="10" w15:restartNumberingAfterBreak="0">
+    <w:nsid w:val="5B7863B1"/>
+    <w:multiLevelType w:val="hybridMultilevel"/>
+    <w:tmpl w:val="9898AD76"/>
+    <w:lvl w:ilvl="0" w:tplc="0C0A0001">
+      <w:start w:val="1"/>
+      <w:numFmt w:val="bullet"/>
+      <w:lvlText w:val=""/>
+      <w:lvlJc w:val="left"/>
+      <w:pPr>
+        <w:ind w:left="720" w:hanging="360"/>
+      </w:pPr>
+      <w:rPr>
+        <w:rFonts w:ascii="Symbol" w:hAnsi="Symbol" w:hint="default"/>
+      </w:rPr>
+    </w:lvl>
+    <w:lvl w:ilvl="1" w:tplc="0C0A0003" w:tentative="1">
+      <w:start w:val="1"/>
+      <w:numFmt w:val="bullet"/>
+      <w:lvlText w:val="o"/>
+      <w:lvlJc w:val="left"/>
+      <w:pPr>
+        <w:ind w:left="1440" w:hanging="360"/>
+      </w:pPr>
+      <w:rPr>
+        <w:rFonts w:ascii="Courier New" w:hAnsi="Courier New" w:cs="Courier New" w:hint="default"/>
+      </w:rPr>
+    </w:lvl>
+    <w:lvl w:ilvl="2" w:tplc="0C0A0005" w:tentative="1">
+      <w:start w:val="1"/>
+      <w:numFmt w:val="bullet"/>
+      <w:lvlText w:val=""/>
+      <w:lvlJc w:val="left"/>
+      <w:pPr>
+        <w:ind w:left="2160" w:hanging="360"/>
+      </w:pPr>
+      <w:rPr>
+        <w:rFonts w:ascii="Wingdings" w:hAnsi="Wingdings" w:hint="default"/>
+      </w:rPr>
+    </w:lvl>
+    <w:lvl w:ilvl="3" w:tplc="0C0A0001" w:tentative="1">
+      <w:start w:val="1"/>
+      <w:numFmt w:val="bullet"/>
+      <w:lvlText w:val=""/>
+      <w:lvlJc w:val="left"/>
+      <w:pPr>
+        <w:ind w:left="2880" w:hanging="360"/>
+      </w:pPr>
+      <w:rPr>
+        <w:rFonts w:ascii="Symbol" w:hAnsi="Symbol" w:hint="default"/>
+      </w:rPr>
+    </w:lvl>
+    <w:lvl w:ilvl="4" w:tplc="0C0A0003" w:tentative="1">
+      <w:start w:val="1"/>
+      <w:numFmt w:val="bullet"/>
+      <w:lvlText w:val="o"/>
+      <w:lvlJc w:val="left"/>
+      <w:pPr>
+        <w:ind w:left="3600" w:hanging="360"/>
+      </w:pPr>
+      <w:rPr>
+        <w:rFonts w:ascii="Courier New" w:hAnsi="Courier New" w:cs="Courier New" w:hint="default"/>
+      </w:rPr>
+    </w:lvl>
+    <w:lvl w:ilvl="5" w:tplc="0C0A0005" w:tentative="1">
+      <w:start w:val="1"/>
+      <w:numFmt w:val="bullet"/>
+      <w:lvlText w:val=""/>
+      <w:lvlJc w:val="left"/>
+      <w:pPr>
+        <w:ind w:left="4320" w:hanging="360"/>
+      </w:pPr>
+      <w:rPr>
+        <w:rFonts w:ascii="Wingdings" w:hAnsi="Wingdings" w:hint="default"/>
+      </w:rPr>
+    </w:lvl>
+    <w:lvl w:ilvl="6" w:tplc="0C0A0001" w:tentative="1">
+      <w:start w:val="1"/>
+      <w:numFmt w:val="bullet"/>
+      <w:lvlText w:val=""/>
+      <w:lvlJc w:val="left"/>
+      <w:pPr>
+        <w:ind w:left="5040" w:hanging="360"/>
+      </w:pPr>
+      <w:rPr>
+        <w:rFonts w:ascii="Symbol" w:hAnsi="Symbol" w:hint="default"/>
+      </w:rPr>
+    </w:lvl>
+    <w:lvl w:ilvl="7" w:tplc="0C0A0003" w:tentative="1">
+      <w:start w:val="1"/>
+      <w:numFmt w:val="bullet"/>
+      <w:lvlText w:val="o"/>
+      <w:lvlJc w:val="left"/>
+      <w:pPr>
+        <w:ind w:left="5760" w:hanging="360"/>
+      </w:pPr>
+      <w:rPr>
+        <w:rFonts w:ascii="Courier New" w:hAnsi="Courier New" w:cs="Courier New" w:hint="default"/>
+      </w:rPr>
+    </w:lvl>
+    <w:lvl w:ilvl="8" w:tplc="0C0A0005" w:tentative="1">
+      <w:start w:val="1"/>
+      <w:numFmt w:val="bullet"/>
+      <w:lvlText w:val=""/>
+      <w:lvlJc w:val="left"/>
+      <w:pPr>
+        <w:ind w:left="6480" w:hanging="360"/>
+      </w:pPr>
+      <w:rPr>
+        <w:rFonts w:ascii="Wingdings" w:hAnsi="Wingdings" w:hint="default"/>
+      </w:rPr>
+    </w:lvl>
+  </w:abstractNum>
+  <w:abstractNum w:abstractNumId="11" w15:restartNumberingAfterBreak="0">
     <w:nsid w:val="5F09174E"/>
     <w:multiLevelType w:val="hybridMultilevel"/>
     <w:tmpl w:val="5C548A2E"/>
@@ -3439,7 +4394,7 @@
       </w:rPr>
     </w:lvl>
   </w:abstractNum>
-  <w:abstractNum w:abstractNumId="7" w15:restartNumberingAfterBreak="0">
+  <w:abstractNum w:abstractNumId="12" w15:restartNumberingAfterBreak="0">
     <w:nsid w:val="60FF553B"/>
     <w:multiLevelType w:val="multilevel"/>
     <w:tmpl w:val="E0CA3050"/>
@@ -3588,7 +4543,7 @@
       </w:rPr>
     </w:lvl>
   </w:abstractNum>
-  <w:abstractNum w:abstractNumId="8" w15:restartNumberingAfterBreak="0">
+  <w:abstractNum w:abstractNumId="13" w15:restartNumberingAfterBreak="0">
     <w:nsid w:val="6B4F0CE5"/>
     <w:multiLevelType w:val="multilevel"/>
     <w:tmpl w:val="C90C62D0"/>
@@ -3701,7 +4656,7 @@
       </w:pPr>
     </w:lvl>
   </w:abstractNum>
-  <w:abstractNum w:abstractNumId="9" w15:restartNumberingAfterBreak="0">
+  <w:abstractNum w:abstractNumId="14" w15:restartNumberingAfterBreak="0">
     <w:nsid w:val="6E3F3DA9"/>
     <w:multiLevelType w:val="multilevel"/>
     <w:tmpl w:val="8DD492DC"/>
@@ -3814,7 +4769,7 @@
       </w:pPr>
     </w:lvl>
   </w:abstractNum>
-  <w:abstractNum w:abstractNumId="10" w15:restartNumberingAfterBreak="0">
+  <w:abstractNum w:abstractNumId="15" w15:restartNumberingAfterBreak="0">
     <w:nsid w:val="765A199B"/>
     <w:multiLevelType w:val="multilevel"/>
     <w:tmpl w:val="20CA2FCE"/>
@@ -3927,7 +4882,7 @@
       </w:pPr>
     </w:lvl>
   </w:abstractNum>
-  <w:abstractNum w:abstractNumId="11" w15:restartNumberingAfterBreak="0">
+  <w:abstractNum w:abstractNumId="16" w15:restartNumberingAfterBreak="0">
     <w:nsid w:val="77F00C19"/>
     <w:multiLevelType w:val="hybridMultilevel"/>
     <w:tmpl w:val="96D01E1E"/>
@@ -4040,7 +4995,7 @@
       </w:rPr>
     </w:lvl>
   </w:abstractNum>
-  <w:abstractNum w:abstractNumId="12" w15:restartNumberingAfterBreak="0">
+  <w:abstractNum w:abstractNumId="17" w15:restartNumberingAfterBreak="0">
     <w:nsid w:val="7D451003"/>
     <w:multiLevelType w:val="hybridMultilevel"/>
     <w:tmpl w:val="CD7C890E"/>
@@ -4154,43 +5109,58 @@
     </w:lvl>
   </w:abstractNum>
   <w:num w:numId="1" w16cid:durableId="1621641637">
+    <w:abstractNumId w:val="16"/>
+  </w:num>
+  <w:num w:numId="2" w16cid:durableId="1052726400">
+    <w:abstractNumId w:val="17"/>
+  </w:num>
+  <w:num w:numId="3" w16cid:durableId="511729091">
+    <w:abstractNumId w:val="13"/>
+  </w:num>
+  <w:num w:numId="4" w16cid:durableId="414084769">
+    <w:abstractNumId w:val="4"/>
+  </w:num>
+  <w:num w:numId="5" w16cid:durableId="746390816">
+    <w:abstractNumId w:val="15"/>
+  </w:num>
+  <w:num w:numId="6" w16cid:durableId="1602451795">
+    <w:abstractNumId w:val="12"/>
+  </w:num>
+  <w:num w:numId="7" w16cid:durableId="1685092228">
+    <w:abstractNumId w:val="6"/>
+  </w:num>
+  <w:num w:numId="8" w16cid:durableId="722018706">
+    <w:abstractNumId w:val="8"/>
+  </w:num>
+  <w:num w:numId="9" w16cid:durableId="347022033">
+    <w:abstractNumId w:val="2"/>
+  </w:num>
+  <w:num w:numId="10" w16cid:durableId="389113721">
     <w:abstractNumId w:val="11"/>
   </w:num>
-  <w:num w:numId="2" w16cid:durableId="1052726400">
-    <w:abstractNumId w:val="12"/>
+  <w:num w:numId="11" w16cid:durableId="1476949597">
+    <w:abstractNumId w:val="7"/>
   </w:num>
-  <w:num w:numId="3" w16cid:durableId="511729091">
-    <w:abstractNumId w:val="8"/>
+  <w:num w:numId="12" w16cid:durableId="1656645070">
+    <w:abstractNumId w:val="9"/>
   </w:num>
-  <w:num w:numId="4" w16cid:durableId="414084769">
-    <w:abstractNumId w:val="1"/>
+  <w:num w:numId="13" w16cid:durableId="1233466997">
+    <w:abstractNumId w:val="14"/>
   </w:num>
-  <w:num w:numId="5" w16cid:durableId="746390816">
+  <w:num w:numId="14" w16cid:durableId="1741439671">
+    <w:abstractNumId w:val="5"/>
+  </w:num>
+  <w:num w:numId="15" w16cid:durableId="1706253829">
+    <w:abstractNumId w:val="0"/>
+  </w:num>
+  <w:num w:numId="16" w16cid:durableId="776216945">
+    <w:abstractNumId w:val="3"/>
+  </w:num>
+  <w:num w:numId="17" w16cid:durableId="1435128642">
     <w:abstractNumId w:val="10"/>
   </w:num>
-  <w:num w:numId="6" w16cid:durableId="1602451795">
-    <w:abstractNumId w:val="7"/>
-  </w:num>
-  <w:num w:numId="7" w16cid:durableId="1685092228">
-    <w:abstractNumId w:val="2"/>
-  </w:num>
-  <w:num w:numId="8" w16cid:durableId="722018706">
-    <w:abstractNumId w:val="4"/>
-  </w:num>
-  <w:num w:numId="9" w16cid:durableId="347022033">
-    <w:abstractNumId w:val="0"/>
-  </w:num>
-  <w:num w:numId="10" w16cid:durableId="389113721">
-    <w:abstractNumId w:val="6"/>
-  </w:num>
-  <w:num w:numId="11" w16cid:durableId="1476949597">
-    <w:abstractNumId w:val="3"/>
-  </w:num>
-  <w:num w:numId="12" w16cid:durableId="1656645070">
-    <w:abstractNumId w:val="5"/>
-  </w:num>
-  <w:num w:numId="13" w16cid:durableId="1233466997">
-    <w:abstractNumId w:val="9"/>
+  <w:num w:numId="18" w16cid:durableId="1517619096">
+    <w:abstractNumId w:val="1"/>
   </w:num>
 </w:numbering>
 </file>

</xml_diff>